<commit_message>
Expand museum design with six distinct event clusters and detailed local puzzle
</commit_message>
<xml_diff>
--- a/docx/01_flow.docx
+++ b/docx/01_flow.docx
@@ -19,7 +19,7 @@
           <w:color w:val="5F6770"/>
           <w:sz w:val="18"/>
         </w:rPr>
-        <w:t>Tài liệu flow · Thiết kế phiên bản 2 · 12 tháng 10 năm 2026</w:t>
+        <w:t>Tài liệu flow · Thiết kế phiên bản 3 · 12 tháng 10 năm 2026</w:t>
       </w:r>
     </w:p>
     <w:p>
@@ -47,7 +47,7 @@
     </w:p>
     <w:p>
       <w:r>
-        <w:t>Mục tiêu thiết kế là khoảng 100 đến 120 phút cho lượt chơi đầu với mức hỗ trợ mặc định. Đây là dự kiến cần kiểm chứng bằng chơi thử, không phải thời lượng đã đo. Người hiểu đáp án hoặc chơi lại có thể hoàn thành nhanh hơn; game không khóa tiến trình bằng đồng hồ để buộc đủ 90 phút.</w:t>
+        <w:t>Mục tiêu thiết kế sau khi bổ sung cụm cửa niêm phong là khoảng 120 đến 150 phút cho lượt chơi đầu với mức hỗ trợ mặc định. Đây là dự kiến cần kiểm chứng bằng chơi thử, không phải thời lượng đã đo. Người hiểu đáp án hoặc chơi lại có thể hoàn thành nhanh hơn; game không khóa tiến trình bằng đồng hồ để buộc đủ 90 phút.</w:t>
       </w:r>
     </w:p>
     <w:p>
@@ -528,6 +528,99 @@
                 <w:sz w:val="19"/>
               </w:rPr>
               <w:t>13 đến 17</w:t>
+            </w:r>
+          </w:p>
+        </w:tc>
+      </w:tr>
+      <w:tr>
+        <w:trPr>
+          <w:cantSplit/>
+        </w:trPr>
+        <w:tc>
+          <w:tcPr>
+            <w:tcW w:type="dxa" w:w="749"/>
+            <w:tcMar>
+              <w:top w:w="90" w:type="dxa"/>
+              <w:bottom w:w="90" w:type="dxa"/>
+              <w:left w:w="95" w:type="dxa"/>
+              <w:right w:w="95" w:type="dxa"/>
+            </w:tcMar>
+          </w:tcPr>
+          <w:p>
+            <w:pPr>
+              <w:spacing w:after="20" w:before="0" w:line="247" w:lineRule="auto"/>
+            </w:pPr>
+            <w:r>
+              <w:rPr>
+                <w:sz w:val="19"/>
+              </w:rPr>
+              <w:t>E08</w:t>
+            </w:r>
+          </w:p>
+        </w:tc>
+        <w:tc>
+          <w:tcPr>
+            <w:tcW w:type="dxa" w:w="3600"/>
+            <w:tcMar>
+              <w:top w:w="90" w:type="dxa"/>
+              <w:bottom w:w="90" w:type="dxa"/>
+              <w:left w:w="95" w:type="dxa"/>
+              <w:right w:w="95" w:type="dxa"/>
+            </w:tcMar>
+          </w:tcPr>
+          <w:p>
+            <w:pPr>
+              <w:spacing w:after="20" w:before="0" w:line="247" w:lineRule="auto"/>
+            </w:pPr>
+            <w:r>
+              <w:rPr>
+                <w:sz w:val="19"/>
+              </w:rPr>
+              <w:t>Lần đầu vào R03, cửa đóng khóa; dựng lại hồ sơ kiểm định bằng các nguồn trong phòng</w:t>
+            </w:r>
+          </w:p>
+        </w:tc>
+        <w:tc>
+          <w:tcPr>
+            <w:tcW w:type="dxa" w:w="3571"/>
+            <w:tcMar>
+              <w:top w:w="90" w:type="dxa"/>
+              <w:bottom w:w="90" w:type="dxa"/>
+              <w:left w:w="95" w:type="dxa"/>
+              <w:right w:w="95" w:type="dxa"/>
+            </w:tcMar>
+          </w:tcPr>
+          <w:p>
+            <w:pPr>
+              <w:spacing w:after="20" w:before="0" w:line="247" w:lineRule="auto"/>
+            </w:pPr>
+            <w:r>
+              <w:rPr>
+                <w:sz w:val="19"/>
+              </w:rPr>
+              <w:t>Mở cửa bằng 3581 và nhặt I12</w:t>
+            </w:r>
+          </w:p>
+        </w:tc>
+        <w:tc>
+          <w:tcPr>
+            <w:tcW w:type="dxa" w:w="1296"/>
+            <w:tcMar>
+              <w:top w:w="90" w:type="dxa"/>
+              <w:bottom w:w="90" w:type="dxa"/>
+              <w:left w:w="95" w:type="dxa"/>
+              <w:right w:w="95" w:type="dxa"/>
+            </w:tcMar>
+          </w:tcPr>
+          <w:p>
+            <w:pPr>
+              <w:spacing w:after="20" w:before="0" w:line="247" w:lineRule="auto"/>
+            </w:pPr>
+            <w:r>
+              <w:rPr>
+                <w:sz w:val="19"/>
+              </w:rPr>
+              <w:t>20 đến 35</w:t>
             </w:r>
           </w:p>
         </w:tc>
@@ -1098,7 +1191,7 @@
     </w:p>
     <w:p>
       <w:r>
-        <w:t>Các khoảng trên cộng lại thành 90 đến 120 phút tùy nhịp đọc và khám phá. Khi chơi thử, mục tiêu là nhóm trung vị đạt 100 đến 120 phút bằng việc điều chỉnh độ rõ và chiều sâu đối chiếu của câu đố. Nếu prototype ngắn hơn, cần thêm nội dung suy luận có nghĩa trước khi chốt thời lượng. Không tăng số tổ hợp vô nghĩa hay thời gian tắt đèn để kéo dài lượt chơi.</w:t>
+        <w:t>Các khoảng trên, gồm E08, cộng lại thành 110 đến 155 phút tùy nhịp đọc và khám phá. Khi chơi thử, mục tiêu là nhóm trung vị đạt 120 đến 150 phút bằng việc điều chỉnh độ rõ và chiều sâu đối chiếu của câu đố. Nếu prototype ngắn hơn, cần thêm nội dung suy luận có nghĩa trước khi chốt thời lượng. Không tăng số tổ hợp vô nghĩa hay thời gian tắt đèn để kéo dài lượt chơi.</w:t>
       </w:r>
     </w:p>
     <w:p>
@@ -1117,6 +1210,39 @@
     <w:p>
       <w:r>
         <w:t>Ba đĩa có cùng ba biểu tượng rõ ràng. Khi chọn LÁ, CHÉN, CHUÔNG và nhấn tay gạt, ngăn dưới khung mở. F02 ở trong ngăn. Sai tổ hợp chỉ tạo tiếng chốt không ăn, không đóng lại đường đi hoặc mất vật phẩm. Một gợi ý sau nhiều lần thử nhắc xem lại tay người trong ảnh lưu trữ.</w:t>
+      </w:r>
+    </w:p>
+    <w:p>
+      <w:pPr>
+        <w:pStyle w:val="Heading2"/>
+      </w:pPr>
+      <w:r>
+        <w:t>E08 Một lần bị nhốt ở gian phục chế</w:t>
+      </w:r>
+    </w:p>
+    <w:p>
+      <w:r>
+        <w:t>Chỉ R03 có cửa tự đóng và khóa một lần khi người chơi đi hẳn vào. Tất cả nguồn mở cửa nằm trong R03 và tiếp cận được ngay, kể cả khi người chơi chưa lấy F02 ngoài phòng. P03 vẫn là cơ cấu ngăn bàn riêng; hoàn thành nó chưa tự mở cửa. Có thể giải hai việc theo thứ tự tùy chọn nếu đã có nguồn của P03.</w:t>
+      </w:r>
+    </w:p>
+    <w:p>
+      <w:r>
+        <w:t>Cửa yêu cầu khôi phục thứ tự kiểm định cuối của các bản gốc trước báo động. Người chơi đối chiếu ảnh khai trương F07, bốn hiện vật D01 đến D04, phiếu sửa khóa I08, bộ sáu ảnh F08, phiếu lệch giờ I09, biên bản đáng ngờ I10, quy trình W07, nhật ký báo động I11 và bảng mã W08. Đây là chín nhóm nguồn trong một câu đố địa phương; không đưa cùng công thức vào những gian khác.</w:t>
+      </w:r>
+    </w:p>
+    <w:p>
+      <w:r>
+        <w:t>F07 ghi năm 2012 và cho thấy chén gốc sứt chân. I09 cho biết máy A nhanh 7 phút, máy B chậm 5 phút. Sau hiệu chỉnh, ảnh hợp lệ trước báo động 21:20 có thứ tự chén 21:12, lá 21:14, mặt nạ 21:16, chuông 21:18. Ảnh chén 21:17 không có vết sứt nên là bản sao; ảnh mặt nạ 21:22 nằm sau báo động. I10 gọi chén 21:17 là bản gốc, vì vậy dòng đó đã bị sửa.</w:t>
+      </w:r>
+    </w:p>
+    <w:p>
+      <w:r>
+        <w:t>Mặt dưới bốn vật lần lượt có trăng, sóng, sao, cây. I08 nói khóa giữ chuẩn khi lắp đặt; F07 xác định năm 2012. Cột 2012 trên W08 đổi bốn dấu thành 3, 5, 8, 1. Đặt 3581 rồi gạt chốt sẽ mở khóa cửa và nhả khay I12. Người chơi cần nhặt I12 để hoàn tất hồ sơ hiện vật ở đoạn cuối. Không có chìa khóa thứ hai cho phòng này.</w:t>
+      </w:r>
+    </w:p>
+    <w:p>
+      <w:r>
+        <w:t>Cửa nhận đáp án đúng ngay, không kiểm một bộ đếm đọc hoặc đồng hồ. Người biết lời giải có thể giải nhanh. Giải sai giữ nguyên đồ, góc vật và vòng số. Sau khi giải, cửa giữ trạng thái mở khóa, không nhốt lần nữa khi quay lại. Cảnh đóng cửa, tiếng gõ, vật rơi, bóng dưới khe và khoảng nghỉ được mô tả theo từng trạng thái trong file event. Chúng không che nội dung bằng chứng.</w:t>
       </w:r>
     </w:p>
     <w:p>
@@ -1165,7 +1291,7 @@
     </w:p>
     <w:p>
       <w:r>
-        <w:t>I03 định nghĩa B là bản gốc, R là bản sao; mã 08 thuộc chén, 17 thuộc lá, 23 thuộc chuông. F03 cho thấy thùng bàn giao chứa B08, B17 và B23. Đáy các hiện vật trong phòng ghi R08, R17 và R23. Người chơi chọn ba dòng đối chiếu trong sổ để xác nhận từng cặp. Sổ chỉ cho xác nhận dòng có đủ nguồn ảnh, giấy và quan sát đáy.</w:t>
+        <w:t>I12 là phiếu vận chuyển gốc lấy từ khay cửa R03, dùng kiểm chứng dòng chén bị sửa trong I10. I03 định nghĩa B là bản gốc, R là bản sao; mã 08 thuộc chén, 17 thuộc lá, 23 thuộc chuông. F03 cho thấy thùng bàn giao chứa B08, B17 và B23. Đáy các hiện vật trong phòng ghi R08, R17 và R23. Người chơi chọn ba dòng đối chiếu trong sổ để xác nhận từng cặp. Sổ chỉ cho xác nhận dòng có đủ nguồn ảnh, giấy và quan sát đáy.</w:t>
       </w:r>
     </w:p>
     <w:p>
@@ -1211,7 +1337,7 @@
     </w:p>
     <w:p>
       <w:r>
-        <w:t>Điều kiện mở là đủ 18 nguồn bắt buộc trong danh mục, ba hồ sơ đúng và đủ ba dấu. Mỗi hàng chỉ nhận xác nhận khi các nguồn của nó đã được ghi nhận; giao diện nói rõ nguồn thiếu trước khi cho chốt hàng. Không để người chơi giải đúng toàn bộ rồi gặp một lớp khóa vô hình. Ba hàng nhớ trạng thái xác nhận qua lưu game.</w:t>
+        <w:t>Điều kiện mở là đủ 19 nguồn bắt buộc trong danh mục, ba hồ sơ đúng và đủ ba dấu. Mỗi hàng chỉ nhận xác nhận khi các nguồn của nó đã được ghi nhận; giao diện nói rõ nguồn thiếu trước khi cho chốt hàng. Không để người chơi giải đúng toàn bộ rồi gặp một lớp khóa vô hình. Ba hàng nhớ trạng thái xác nhận qua lưu game.</w:t>
       </w:r>
     </w:p>
     <w:p>
@@ -1391,7 +1517,7 @@
               <w:rPr>
                 <w:sz w:val="19"/>
               </w:rPr>
-              <w:t>I00, I01, I02, I03, I04</w:t>
+              <w:t>I00, I01, I02, I03, I04, I12</w:t>
             </w:r>
           </w:p>
         </w:tc>
@@ -1720,7 +1846,7 @@
     </w:p>
     <w:p>
       <w:r>
-        <w:t>Có 18 nguồn bắt buộc trước chìa khóa. O05 là phần thưởng bắt buộc cho đoạn kết. O04, F05, F06, I05, I06, I07, W04, W05, W06 và các ảnh chụp Camera đều không nằm trong điều kiện mở hộp. Đồ trang trí và nét nhiễu không có cờ tiến trình.</w:t>
+        <w:t>Có 19 nguồn bắt buộc trước chìa khóa. I12 làm cụm E08 nối vào hồ sơ chính; F07, F08, I08 đến I11, W07, W08 và D04 phục vụ lời giải cửa nhưng không tạo thêm hạn ngạch nhặt ở hộp cuối. O05 là phần thưởng bắt buộc cho đoạn kết. O04, F05, F06, I05, I06, I07, W04, W05, W06 và các ảnh chụp Camera đều không nằm trong điều kiện mở hộp. Đồ trang trí và nét nhiễu không có cờ tiến trình.</w:t>
       </w:r>
     </w:p>
     <w:p>
@@ -1748,7 +1874,7 @@
     </w:p>
     <w:p>
       <w:r>
-        <w:t>Máy ảnh, ảnh tùy chọn, sự kiện kinh dị và âm thanh không được giữ một chìa khóa hoặc nguồn bắt buộc. Bỏ qua chúng vẫn hoàn thành đường chính. Không tồn tại NPC giết người, đánh mất đồ do thử sai hay yêu cầu bắt đầu lại lượt chơi.</w:t>
+        <w:t>Máy ảnh, ảnh tùy chọn và các cảnh hù không được giữ chìa khóa hoặc nguồn bắt buộc. E08 là một cụm gameplay bắt buộc riêng: cửa R03 tạm khóa và I12 nằm trong khay mở bằng câu đố. Mọi dữ liệu cần cho E08 đều ở trong phòng, không phụ thuộc cảnh hù, Camera hoặc đồ ngoài phòng. Không tồn tại NPC giết người, đánh mất đồ do thử sai hay yêu cầu bắt đầu lại lượt chơi.</w:t>
       </w:r>
     </w:p>
     <w:p>
@@ -1761,7 +1887,7 @@
     </w:p>
     <w:p>
       <w:r>
-        <w:t>Sổ hiển thị ba hồ sơ và nguồn đang thiếu trong hồ sơ đang làm. Một nút gợi ý có ba mức: chỉ loại nguồn cần xem, chỉ chi tiết liên quan, rồi giải thích thao tác hoặc đáp án. Gợi ý không tự bật lời giải sau một thời gian cố định; người chơi chủ động dùng. Sau ba lần thử sai cùng một cơ cấu, game có thể nhắc rằng nút gợi ý đang có sẵn.</w:t>
+        <w:t>Sổ hiển thị ba hồ sơ và nguồn đang thiếu trong hồ sơ đang làm. Khi bị nhốt trong E08, mục tiêu cục bộ mở cửa được ưu tiên; giải xong trả về mục tiêu chính. Có thể đối chiếu nhiều tài liệu đồng thời, không chỉ hai thẻ. Một nút gợi ý có ba mức: chỉ loại nguồn cần xem, chỉ chi tiết liên quan, rồi giải thích thao tác hoặc đáp án. Gợi ý không tự bật lời giải sau một thời gian cố định; người chơi chủ động dùng. Sau ba lần thử sai cùng một cơ cấu, game có thể nhắc rằng nút gợi ý đang có sẵn.</w:t>
       </w:r>
     </w:p>
     <w:p>
@@ -1771,7 +1897,7 @@
     </w:p>
     <w:p>
       <w:r>
-        <w:t>Event được đặt giữa hai cụm suy luận hoặc lúc di chuyển. Khi đọc giấy hay giải cơ cấu, hệ thống không tắt đèn và không phát một cú giật lớn che thông tin. Một nguồn âm từ gian khác có thể gợi quay lại hiện vật, nhưng sổ luôn có cách chỉ đường thay thế. Tài liệu event quy định rõ lượt quay đầu và ngõ cụt để bảo đảm không tạo kẹt. Nhánh scare đánh ngất mới là tùy chọn, không chết và giữ tiến trình; sau khi có chìa khóa không chạy thêm scare trên đường về.</w:t>
+        <w:t>Event được đặt giữa hai cụm suy luận hoặc lúc di chuyển. Khi đọc giấy hay giải cơ cấu, hệ thống không tắt đèn và không phát một cú giật lớn che thông tin. Một nguồn âm từ gian khác có thể gợi quay lại hiện vật, nhưng sổ luôn có cách chỉ đường thay thế. Tài liệu event quy định rõ lượt quay đầu và ngõ cụt để bảo đảm không tạo kẹt. Nhánh scare đánh ngất là tùy chọn, không chết và giữ tiến trình; sau khi có chìa khóa không chạy thêm scare trên đường về. Sáu cụm lớn gồm E08 cửa niêm phong, E04 chim, E05 E06 lựa chọn quay đầu, E09 truy nguồn tiếng gõ, E10 Camera và bóng trong hốc, E11 bản ghi âm. Chỉ E08 đóng khóa một phòng; những cụm khác không bắt giải lại cùng dạng câu đố.</w:t>
       </w:r>
     </w:p>
     <w:p>
@@ -1784,12 +1910,12 @@
     </w:p>
     <w:p>
       <w:r>
-        <w:t>Lưu các nguồn đã nhặt, nguồn đã quan sát, góc xoay hiện vật, đĩa đang chọn, ngăn đã mở, kết luận hồ sơ, dấu đã áp, key_owned, bed_open và các event đã hoàn tất. Các item không bị tiêu hao. Tải game không đóng ngăn chứa vật chưa nhặt, không tạo thêm chìa khóa và không chạy lại một jumpscare đã xem.</w:t>
+        <w:t>Lưu cả trạng thái cửa E08, bốn vòng số, khay I12 và các nguồn của câu đố địa phương. Lưu các nguồn đã nhặt, nguồn đã quan sát, góc xoay hiện vật, đĩa đang chọn, ngăn đã mở, kết luận hồ sơ, dấu đã áp, key_owned, bed_open và các event đã hoàn tất. Các item không bị tiêu hao. Tải game không đóng ngăn chứa vật chưa nhặt, không tạo thêm chìa khóa và không chạy lại một jumpscare đã xem.</w:t>
       </w:r>
     </w:p>
     <w:p>
       <w:r>
-        <w:t>Trước khi chốt bản chơi, thử các tình huống: đi thẳng tới giường; tới hộp trước mọi câu đố; đoán đúng tổ hợp nhưng thiếu một nguồn; lấy thiếu một món trong B2; bỏ máy ảnh; chụp rồi xóa toàn bộ ảnh cá nhân; bỏ mọi nội dung tùy chọn; dùng gợi ý cuối; lưu trước và sau khi lấy chìa khóa; tải lại khi giường đang mở. Mỗi trường hợp phải kết thúc được và nêu rõ bước còn thiếu.</w:t>
+        <w:t>Trước khi chốt bản chơi, thử vào R03 trước F02, bỏ âm, không nhặt Camera, đoán đúng 3581 ngay, lấy thiếu I12, tải trong lúc cửa đang đóng và quay lại R03 sau khi giải. Tiếp tục thử các tình huống: đi thẳng tới giường; tới hộp trước mọi câu đố; đoán đúng tổ hợp nhưng thiếu một nguồn; lấy thiếu một món trong B2; bỏ máy ảnh; chụp rồi xóa toàn bộ ảnh cá nhân; bỏ mọi nội dung tùy chọn; dùng gợi ý cuối; lưu trước và sau khi lấy chìa khóa; tải lại khi giường đang mở. Mỗi trường hợp phải kết thúc được và nêu rõ bước còn thiếu.</w:t>
       </w:r>
     </w:p>
     <w:p>
@@ -1820,7 +1946,7 @@
       <w:rPr>
         <w:sz w:val="16"/>
       </w:rPr>
-      <w:t xml:space="preserve">Phiên bản 2  ·  </w:t>
+      <w:t xml:space="preserve">Phiên bản 3  ·  </w:t>
     </w:r>
     <w:fldSimple w:instr="PAGE"/>
   </w:p>

</xml_diff>